<commit_message>
Atualização do documento final Entrega_14.09_Final
</commit_message>
<xml_diff>
--- a/pdf-text-similarity/Entrega_14.09_Final.docx
+++ b/pdf-text-similarity/Entrega_14.09_Final.docx
@@ -1,18 +1,17 @@
 
 <file path=word/document.xml><?xml version="1.0" encoding="utf-8"?>
-<w:document xmlns:wpc="http://schemas.microsoft.com/office/word/2010/wordprocessingCanvas" xmlns:cx="http://schemas.microsoft.com/office/drawing/2014/chartex" xmlns:cx1="http://schemas.microsoft.com/office/drawing/2015/9/8/chartex" xmlns:cx2="http://schemas.microsoft.com/office/drawing/2015/10/21/chartex" xmlns:cx3="http://schemas.microsoft.com/office/drawing/2016/5/9/chartex" xmlns:cx4="http://schemas.microsoft.com/office/drawing/2016/5/10/chartex" xmlns:cx5="http://schemas.microsoft.com/office/drawing/2016/5/11/chartex" xmlns:cx6="http://schemas.microsoft.com/office/drawing/2016/5/12/chartex" xmlns:cx7="http://schemas.microsoft.com/office/drawing/2016/5/13/chartex" xmlns:cx8="http://schemas.microsoft.com/office/drawing/2016/5/14/chartex" xmlns:mc="http://schemas.openxmlformats.org/markup-compatibility/2006" xmlns:aink="http://schemas.microsoft.com/office/drawing/2016/ink" xmlns:am3d="http://schemas.microsoft.com/office/drawing/2017/model3d" xmlns:o="urn:schemas-microsoft-com:office:office" xmlns:oel="http://schemas.microsoft.com/office/2019/extlst" xmlns:r="http://schemas.openxmlformats.org/officeDocument/2006/relationships" xmlns:m="http://schemas.openxmlformats.org/officeDocument/2006/math" xmlns:v="urn:schemas-microsoft-com:vml" xmlns:wp14="http://schemas.microsoft.com/office/word/2010/wordprocessingDrawing" xmlns:wp="http://schemas.openxmlformats.org/drawingml/2006/wordprocessingDrawing" xmlns:w10="urn:schemas-microsoft-com:office:word" xmlns:w="http://schemas.openxmlformats.org/wordprocessingml/2006/main" xmlns:w14="http://schemas.microsoft.com/office/word/2010/wordml" xmlns:w15="http://schemas.microsoft.com/office/word/2012/wordml" xmlns:w16cex="http://schemas.microsoft.com/office/word/2018/wordml/cex" xmlns:w16cid="http://schemas.microsoft.com/office/word/2016/wordml/cid" xmlns:w16="http://schemas.microsoft.com/office/word/2018/wordml" xmlns:w16du="http://schemas.microsoft.com/office/word/2023/wordml/word16du" xmlns:w16sdtdh="http://schemas.microsoft.com/office/word/2020/wordml/sdtdatahash" xmlns:w16sdtfl="http://schemas.microsoft.com/office/word/2024/wordml/sdtformatlock" xmlns:w16se="http://schemas.microsoft.com/office/word/2015/wordml/symex" xmlns:wpg="http://schemas.microsoft.com/office/word/2010/wordprocessingGroup" xmlns:wpi="http://schemas.microsoft.com/office/word/2010/wordprocessingInk" xmlns:wne="http://schemas.microsoft.com/office/word/2006/wordml" xmlns:wps="http://schemas.microsoft.com/office/word/2010/wordprocessingShape" mc:Ignorable="w14 w15 w16se w16cid w16 w16cex w16sdtdh w16sdtfl w16du wp14">
+<w:document xmlns:wpc="http://schemas.microsoft.com/office/word/2010/wordprocessingCanvas" xmlns:mc="http://schemas.openxmlformats.org/markup-compatibility/2006" xmlns:o="urn:schemas-microsoft-com:office:office" xmlns:r="http://schemas.openxmlformats.org/officeDocument/2006/relationships" xmlns:m="http://schemas.openxmlformats.org/officeDocument/2006/math" xmlns:v="urn:schemas-microsoft-com:vml" xmlns:wp14="http://schemas.microsoft.com/office/word/2010/wordprocessingDrawing" xmlns:wp="http://schemas.openxmlformats.org/drawingml/2006/wordprocessingDrawing" xmlns:w10="urn:schemas-microsoft-com:office:word" xmlns:w="http://schemas.openxmlformats.org/wordprocessingml/2006/main" xmlns:w14="http://schemas.microsoft.com/office/word/2010/wordml" xmlns:w15="http://schemas.microsoft.com/office/word/2012/wordml" xmlns:w16se="http://schemas.microsoft.com/office/word/2015/wordml/symex" xmlns:w16cid="http://schemas.microsoft.com/office/word/2016/wordml/cid" xmlns:w16="http://schemas.microsoft.com/office/word/2018/wordml" xmlns:w16cex="http://schemas.microsoft.com/office/word/2018/wordml/cex" xmlns:w16sdtdh="http://schemas.microsoft.com/office/word/2020/wordml/sdtdatahash" xmlns:wne="http://schemas.microsoft.com/office/word/2006/wordml" xmlns:wpg="http://schemas.microsoft.com/office/word/2010/wordprocessingGroup" xmlns:wps="http://schemas.microsoft.com/office/word/2010/wordprocessingShape" mc:Ignorable="w14 w15 w16se w16cid w16 w16cex w16sdtdh wp14">
   <w:body>
     <w:p>
       <w:pPr>
         <w:ind w:firstLine="420"/>
         <w:jc w:val="both"/>
-        <w:rPr>
-          <w:lang w:val="pt-BR"/>
-        </w:rPr>
       </w:pPr>
       <w:r>
         <w:rPr>
-          <w:lang w:val="pt-BR"/>
+          <w:rFonts w:ascii="Times New Roman" w:hAnsi="Times New Roman" w:eastAsia="Times New Roman" w:cs="Times New Roman" w:csTheme="minorBidi"/>
+          <w:sz w:val="24"/>
+          <w:szCs w:val="22"/>
         </w:rPr>
         <w:t>INTRODUÇÃO</w:t>
       </w:r>
@@ -21,13 +20,12 @@
       <w:pPr>
         <w:ind w:firstLine="420"/>
         <w:jc w:val="both"/>
-        <w:rPr>
-          <w:lang w:val="pt-BR"/>
-        </w:rPr>
       </w:pPr>
       <w:r>
         <w:rPr>
-          <w:lang w:val="pt-BR"/>
+          <w:rFonts w:ascii="Times New Roman" w:hAnsi="Times New Roman" w:eastAsia="Times New Roman" w:cs="Times New Roman" w:csTheme="minorBidi"/>
+          <w:sz w:val="24"/>
+          <w:szCs w:val="22"/>
         </w:rPr>
         <w:t>O turismo consolida-se como um vetor estratégico de desenvolvimento socioeconômico e de descentralização da renda em países em desenvolvimento, especialmente em regiões afetadas pela retração das atividades industriais e agrícolas tradicionais. Alinhada a essa tendência, a Nova Lei Geral do Turismo (Lei nº 14.978/2024) oficializou a atividade turística em pequenas propriedades e na agricultura familiar como uma extensão complementar do trabalho no campo. Nesse cenário, a transição para modalidades alternativas — com destaque para o ecoturismo, o agroturismo e o turismo ecológico — surge como uma via para diversificar a matriz econômica local. O grande diferencial dessa dinâmica é que, mesmo após o sucesso da exploração turística, a propriedade mantém suas práticas produtivas tradicionais plenamente ativas (SENAR, 2020). Essas vertentes promovem a valorização da cultura regional, a permanência das famílias no campo, a inclusão social e o fortalecimento do orgulho comunitário. Distanciando-se do turismo de massa, o modelo valoriza o "saber fazer" local, a autenticidade das paisagens e o patrimônio imaterial de cada território, gerando ocupações complementares e renda sem descaracterizar a identidade camponesa (NIEDERLE; SCHNEIDER, 2011).</w:t>
       </w:r>
@@ -36,27 +34,28 @@
       <w:pPr>
         <w:ind w:firstLine="420"/>
         <w:jc w:val="both"/>
-        <w:rPr>
-          <w:lang w:val="pt-BR"/>
-        </w:rPr>
       </w:pPr>
       <w:r>
         <w:rPr>
-          <w:lang w:val="pt-BR"/>
+          <w:rFonts w:ascii="Times New Roman" w:hAnsi="Times New Roman" w:eastAsia="Times New Roman" w:cs="Times New Roman" w:csTheme="minorBidi"/>
+          <w:sz w:val="24"/>
+          <w:szCs w:val="22"/>
         </w:rPr>
         <w:t xml:space="preserve">Segundo dados do Instituto Brasileiro de Geografia e Estatística (IBGE, 2019), </w:t>
       </w:r>
-      <w:proofErr w:type="gramStart"/>
       <w:r>
         <w:rPr>
-          <w:lang w:val="pt-BR"/>
+          <w:rFonts w:ascii="Times New Roman" w:hAnsi="Times New Roman" w:eastAsia="Times New Roman" w:cs="Times New Roman" w:csTheme="minorBidi"/>
+          <w:sz w:val="24"/>
+          <w:szCs w:val="22"/>
         </w:rPr>
         <w:t>cerca de 77% do total dos estabelecimentos agrícolas no país pertencem</w:t>
       </w:r>
-      <w:proofErr w:type="gramEnd"/>
       <w:r>
         <w:rPr>
-          <w:lang w:val="pt-BR"/>
+          <w:rFonts w:ascii="Times New Roman" w:hAnsi="Times New Roman" w:eastAsia="Times New Roman" w:cs="Times New Roman" w:csTheme="minorBidi"/>
+          <w:sz w:val="24"/>
+          <w:szCs w:val="22"/>
         </w:rPr>
         <w:t xml:space="preserve"> à agricultura familiar, o que reforça a relevância de articular o turismo rural como uma estratégia de apoio e fortalecimento desse setor produtivo. Sustenta-se, que, apesar desse expressivo potencial, a expansão da atividade no Brasil ocorre sob uma profunda heterogeneidade estrutural. Esse panorama revela a coexistência de setores modernos e altamente produtivos ao lado de bolsões de subsistência (BARTHOLO; BURSZTYN; SANSOLO, 2009). Enquanto o mercado turístico tradicional se consolida por meio de grandes empreendimentos de capital intensivo, as iniciativas de turismo de base comunitária e rural frequentemente operam às margens desses fluxos econômicos, lutando por autonomia financeira e inclusão social. Essa disparidade reflete-se diretamente na distribuição espacial dos recursos de fomento e crédito no território (CRUZ, 2009): enquanto municípios-polo e capitais regionais concentram a maior parte dos investimentos privados e da infraestrutura de grande escala, pequenas localidades vocacionadas ao ecoturismo comunitário enfrentam severas restrições de liquidez financeira (CORIOLANO, 2009).</w:t>
       </w:r>
@@ -65,21 +64,21 @@
       <w:pPr>
         <w:ind w:firstLine="420"/>
         <w:jc w:val="both"/>
-        <w:rPr>
-          <w:lang w:val="pt-BR"/>
-        </w:rPr>
       </w:pPr>
       <w:r>
         <w:rPr>
-          <w:lang w:val="pt-BR"/>
+          <w:rFonts w:ascii="Times New Roman" w:hAnsi="Times New Roman" w:eastAsia="Times New Roman" w:cs="Times New Roman" w:csTheme="minorBidi"/>
+          <w:sz w:val="24"/>
+          <w:szCs w:val="22"/>
         </w:rPr>
         <w:t xml:space="preserve">Ressalta-se, que a mera existência de atrativos naturais ou culturais não garante o desenvolvimento regional (CAETANO; WEGNER; XAVIER, 2023). Atualmente, a base econômica de muitas comunidades é fragilizada pela falta de planejamento público e pela escassez de investimentos — recursos que se mostram fundamentais para fomentar um setor que, apenas nas zonas rurais, tem o potencial de impactar 25 milhões de brasileiros (IBGE, 2022). Diante desse cenário de subinvestimento e da ausência de políticas integradas para mitigar tais assimetrias, o sucesso operacional de um destino turístico passa </w:t>
       </w:r>
       <w:r>
         <w:rPr>
-          <w:lang w:val="pt-BR"/>
+          <w:rFonts w:ascii="Times New Roman" w:hAnsi="Times New Roman" w:eastAsia="Times New Roman" w:cs="Times New Roman" w:csTheme="minorBidi"/>
+          <w:sz w:val="24"/>
+          <w:szCs w:val="22"/>
         </w:rPr>
-        <w:lastRenderedPageBreak/>
         <w:t>a depender do nível de articulação organizacional e da capacidade do território de converter seus ativos em produtos comercializáveis e sustentáveis. Essa conversão é crucial para que a diversificação gere valor cultural, preserve a biodiversidade e promova o avanço socioeconômico local. Afinal, as limitações no acesso a mecanismos formais de financiamento e a falta de infraestrutura de suporte (como telecomunicações e transporte) constituem, hoje, os dois maiores gargalos para o desenvolvimento turístico sustentável em áreas não urbanas (UN TOURISM, 2023).</w:t>
       </w:r>
     </w:p>
@@ -87,13 +86,12 @@
       <w:pPr>
         <w:ind w:firstLine="420"/>
         <w:jc w:val="both"/>
-        <w:rPr>
-          <w:lang w:val="pt-BR"/>
-        </w:rPr>
       </w:pPr>
       <w:r>
         <w:rPr>
-          <w:lang w:val="pt-BR"/>
+          <w:rFonts w:ascii="Times New Roman" w:hAnsi="Times New Roman" w:eastAsia="Times New Roman" w:cs="Times New Roman" w:csTheme="minorBidi"/>
+          <w:sz w:val="24"/>
+          <w:szCs w:val="22"/>
         </w:rPr>
         <w:t>Nesse contexto, o objetivo central deste trabalho é analisar a estrutura dos municípios para o desenvolvimento do ecoturismo de base comunitária, avaliando em que medida a circulação de capital financeiro no campo dialoga com a oferta produtiva e a atratividade dos destinos. A escolha dos recortes espaciais justifica-se por seus perfis geográficos e institucionais marcadamente contrastantes. O Rio Grande do Sul apresenta um histórico consolidado de rotas rurais e um cooperativismo de crédito integrado; por outro lado, a Bahia conta com polos turísticos de grande escala concentrados na faixa litorânea, enfrentando o desafio de interiorizar as receitas do setor em direção ao Semiárido e à Chapada Diamantina.</w:t>
       </w:r>
@@ -102,27 +100,28 @@
       <w:pPr>
         <w:ind w:firstLine="420"/>
         <w:jc w:val="both"/>
-        <w:rPr>
-          <w:lang w:val="pt-BR"/>
-        </w:rPr>
       </w:pPr>
       <w:r>
         <w:rPr>
-          <w:lang w:val="pt-BR"/>
+          <w:rFonts w:ascii="Times New Roman" w:hAnsi="Times New Roman" w:eastAsia="Times New Roman" w:cs="Times New Roman" w:csTheme="minorBidi"/>
+          <w:sz w:val="24"/>
+          <w:szCs w:val="22"/>
         </w:rPr>
         <w:t xml:space="preserve">A presente pesquisa propõe, portanto, a formulação do Índice Sintético de Viabilidade Territorial (ISVT) como uma ferramenta de </w:t>
       </w:r>
-      <w:proofErr w:type="spellStart"/>
       <w:r>
         <w:rPr>
-          <w:lang w:val="pt-BR"/>
+          <w:rFonts w:ascii="Times New Roman" w:hAnsi="Times New Roman" w:eastAsia="Times New Roman" w:cs="Times New Roman" w:csTheme="minorBidi"/>
+          <w:sz w:val="24"/>
+          <w:szCs w:val="22"/>
         </w:rPr>
         <w:t>geointeligência</w:t>
       </w:r>
-      <w:proofErr w:type="spellEnd"/>
       <w:r>
         <w:rPr>
-          <w:lang w:val="pt-BR"/>
+          <w:rFonts w:ascii="Times New Roman" w:hAnsi="Times New Roman" w:eastAsia="Times New Roman" w:cs="Times New Roman" w:csTheme="minorBidi"/>
+          <w:sz w:val="24"/>
+          <w:szCs w:val="22"/>
         </w:rPr>
         <w:t xml:space="preserve"> aplicada à governança do turismo na Bahia e no Rio Grande do Sul. Estruturado a partir da convergência de Big Data de plataformas digitais, dados censitários e indicadores de crédito do Banco Central, o ISVT funciona como um modelo de inteligência territorial desenhado para mapear contrastes latentes e fundamentar critérios científicos universais de monitoramento (MISKALO-CRUZ; GÂNDARA, 2017). O objetivo central é otimizar a alocação de capital público e corrigir assimetrias na distribuição regional de fomento ao ecoturismo e à economia comunitária (BOLZÁN; MENDES FILHO, 2024), subsidiando o planejamento de políticas públicas integradas de desenvolvimento regional em estados com estruturas macroeconômicas tão distintas (BREGOLIN, 2018).</w:t>
       </w:r>
@@ -131,63 +130,69 @@
       <w:pPr>
         <w:ind w:firstLine="420"/>
         <w:jc w:val="both"/>
-        <w:rPr>
-          <w:lang w:val="pt-BR"/>
-        </w:rPr>
       </w:pPr>
       <w:r>
         <w:rPr>
-          <w:lang w:val="pt-BR"/>
+          <w:rFonts w:ascii="Times New Roman" w:hAnsi="Times New Roman" w:eastAsia="Times New Roman" w:cs="Times New Roman" w:csTheme="minorBidi"/>
+          <w:sz w:val="24"/>
+          <w:szCs w:val="22"/>
         </w:rPr>
         <w:t xml:space="preserve">Este artigo está organizado em três seções que, integradas, discutem a alocação de capital público para o desenvolvimento regional e a superação da assimetria de informação geográfica. A primeira seção estabelece um diálogo teórico entre os conceitos de assimetria de crédito (Stiglitz), planejamento do capital regional (Furtado) e território usado (Milton Santos), apresentando uma crítica aos modelos puramente cadastrais de concessão bancária em favor de abordagens baseadas em inteligência territorial. A segunda seção detalha o protocolo metodológico de coleta, anonimização e compatibilização dos microdados do Banco Central do Brasil (BCB) e de plataformas digitais para as malhas estaduais analisadas, além de demonstrar as equações matemáticas e os critérios de pesos do modelo </w:t>
       </w:r>
-      <w:proofErr w:type="spellStart"/>
       <w:r>
         <w:rPr>
-          <w:lang w:val="pt-BR"/>
+          <w:rFonts w:ascii="Times New Roman" w:hAnsi="Times New Roman" w:eastAsia="Times New Roman" w:cs="Times New Roman" w:csTheme="minorBidi"/>
+          <w:sz w:val="24"/>
+          <w:szCs w:val="22"/>
         </w:rPr>
         <w:t>Analytic</w:t>
       </w:r>
-      <w:proofErr w:type="spellEnd"/>
       <w:r>
         <w:rPr>
-          <w:lang w:val="pt-BR"/>
+          <w:rFonts w:ascii="Times New Roman" w:hAnsi="Times New Roman" w:eastAsia="Times New Roman" w:cs="Times New Roman" w:csTheme="minorBidi"/>
+          <w:sz w:val="24"/>
+          <w:szCs w:val="22"/>
         </w:rPr>
         <w:t xml:space="preserve"> </w:t>
       </w:r>
-      <w:proofErr w:type="spellStart"/>
       <w:r>
         <w:rPr>
-          <w:lang w:val="pt-BR"/>
+          <w:rFonts w:ascii="Times New Roman" w:hAnsi="Times New Roman" w:eastAsia="Times New Roman" w:cs="Times New Roman" w:csTheme="minorBidi"/>
+          <w:sz w:val="24"/>
+          <w:szCs w:val="22"/>
         </w:rPr>
         <w:t>Hierarchy</w:t>
       </w:r>
-      <w:proofErr w:type="spellEnd"/>
       <w:r>
         <w:rPr>
-          <w:lang w:val="pt-BR"/>
+          <w:rFonts w:ascii="Times New Roman" w:hAnsi="Times New Roman" w:eastAsia="Times New Roman" w:cs="Times New Roman" w:csTheme="minorBidi"/>
+          <w:sz w:val="24"/>
+          <w:szCs w:val="22"/>
         </w:rPr>
         <w:t xml:space="preserve"> </w:t>
       </w:r>
-      <w:proofErr w:type="spellStart"/>
       <w:r>
         <w:rPr>
-          <w:lang w:val="pt-BR"/>
+          <w:rFonts w:ascii="Times New Roman" w:hAnsi="Times New Roman" w:eastAsia="Times New Roman" w:cs="Times New Roman" w:csTheme="minorBidi"/>
+          <w:sz w:val="24"/>
+          <w:szCs w:val="22"/>
         </w:rPr>
         <w:t>Process</w:t>
       </w:r>
-      <w:proofErr w:type="spellEnd"/>
       <w:r>
         <w:rPr>
-          <w:lang w:val="pt-BR"/>
+          <w:rFonts w:ascii="Times New Roman" w:hAnsi="Times New Roman" w:eastAsia="Times New Roman" w:cs="Times New Roman" w:csTheme="minorBidi"/>
+          <w:sz w:val="24"/>
+          <w:szCs w:val="22"/>
         </w:rPr>
         <w:t xml:space="preserve"> (AHP). A terceira seção dedica-se à exibição analítica e visual dos mapas de clusters do Rio Grande do Sul e da Bahia, realizando uma análise comparada que identifica padrões de falhas de mercado e contrasta a atuação das redes de crédito, </w:t>
       </w:r>
       <w:r>
         <w:rPr>
-          <w:lang w:val="pt-BR"/>
+          <w:rFonts w:ascii="Times New Roman" w:hAnsi="Times New Roman" w:eastAsia="Times New Roman" w:cs="Times New Roman" w:csTheme="minorBidi"/>
+          <w:sz w:val="24"/>
+          <w:szCs w:val="22"/>
         </w:rPr>
-        <w:lastRenderedPageBreak/>
         <w:t>especificamente a capilaridade das cooperativas rurais no cenário gaúcho versus a centralidade observada no território baiano.</w:t>
       </w:r>
     </w:p>
@@ -195,27 +200,28 @@
       <w:pPr>
         <w:ind w:firstLine="420"/>
         <w:jc w:val="both"/>
-        <w:rPr>
-          <w:lang w:val="pt-BR"/>
-        </w:rPr>
       </w:pPr>
       <w:r>
         <w:rPr>
-          <w:lang w:val="pt-BR"/>
+          <w:rFonts w:ascii="Times New Roman" w:hAnsi="Times New Roman" w:eastAsia="Times New Roman" w:cs="Times New Roman" w:csTheme="minorBidi"/>
+          <w:sz w:val="24"/>
+          <w:szCs w:val="22"/>
         </w:rPr>
         <w:t xml:space="preserve">As considerações finais apresentam recomendações de políticas públicas para o desenho de editais de fundos constitucionais e governança bancária de fomento, discutindo também as limitações de escala dos dados </w:t>
       </w:r>
-      <w:proofErr w:type="spellStart"/>
       <w:r>
         <w:rPr>
-          <w:lang w:val="pt-BR"/>
+          <w:rFonts w:ascii="Times New Roman" w:hAnsi="Times New Roman" w:eastAsia="Times New Roman" w:cs="Times New Roman" w:csTheme="minorBidi"/>
+          <w:sz w:val="24"/>
+          <w:szCs w:val="22"/>
         </w:rPr>
         <w:t>biestaduais</w:t>
       </w:r>
-      <w:proofErr w:type="spellEnd"/>
       <w:r>
         <w:rPr>
-          <w:lang w:val="pt-BR"/>
+          <w:rFonts w:ascii="Times New Roman" w:hAnsi="Times New Roman" w:eastAsia="Times New Roman" w:cs="Times New Roman" w:csTheme="minorBidi"/>
+          <w:sz w:val="24"/>
+          <w:szCs w:val="22"/>
         </w:rPr>
         <w:t xml:space="preserve"> e os horizontes para o uso de Big Data governamental.</w:t>
       </w:r>
@@ -224,28 +230,26 @@
       <w:pPr>
         <w:ind w:firstLine="420"/>
         <w:jc w:val="both"/>
-        <w:rPr>
-          <w:lang w:val="pt-BR"/>
-        </w:rPr>
       </w:pPr>
     </w:p>
     <w:p>
       <w:pPr>
         <w:ind w:firstLine="420"/>
         <w:jc w:val="both"/>
-        <w:rPr>
-          <w:lang w:val="pt-BR"/>
-        </w:rPr>
       </w:pPr>
       <w:r>
         <w:rPr>
-          <w:lang w:val="pt-BR"/>
+          <w:rFonts w:ascii="Times New Roman" w:hAnsi="Times New Roman" w:eastAsia="Times New Roman" w:cs="Times New Roman" w:csTheme="minorBidi"/>
+          <w:sz w:val="24"/>
+          <w:szCs w:val="22"/>
         </w:rPr>
         <w:t>M</w:t>
       </w:r>
       <w:r>
         <w:rPr>
-          <w:lang w:val="pt-BR"/>
+          <w:rFonts w:ascii="Times New Roman" w:hAnsi="Times New Roman" w:eastAsia="Times New Roman" w:cs="Times New Roman" w:csTheme="minorBidi"/>
+          <w:sz w:val="24"/>
+          <w:szCs w:val="22"/>
         </w:rPr>
         <w:t>ETODOLOGIA</w:t>
       </w:r>
@@ -254,41 +258,44 @@
       <w:pPr>
         <w:ind w:firstLine="420"/>
         <w:jc w:val="both"/>
-        <w:rPr>
-          <w:lang w:val="pt-BR"/>
-        </w:rPr>
       </w:pPr>
       <w:r>
         <w:rPr>
-          <w:lang w:val="pt-BR"/>
+          <w:rFonts w:ascii="Times New Roman" w:hAnsi="Times New Roman" w:eastAsia="Times New Roman" w:cs="Times New Roman" w:csTheme="minorBidi"/>
+          <w:sz w:val="24"/>
+          <w:szCs w:val="22"/>
         </w:rPr>
         <w:t xml:space="preserve">A presente pesquisa adota uma abordagem analítica de natureza aplicada e quantitativa, estruturada a partir da convergência de múltiplas fontes oficiais de microdados territoriais. O universo amostral foi delimitado com base nas diretrizes do Ministério do Turismo para o Mapa do Turismo Brasileiro (BRASIL, 2026), resultando em um recorte focado em 420 municípios-alvo com vocação ativa para o ecoturismo e o turismo de base comunitária (TBC), dos quais 136 estão localizados na Bahia e 284 no Rio Grande do Sul. Embora as bases de dados do </w:t>
       </w:r>
-      <w:proofErr w:type="spellStart"/>
       <w:r>
         <w:rPr>
-          <w:lang w:val="pt-BR"/>
+          <w:rFonts w:ascii="Times New Roman" w:hAnsi="Times New Roman" w:eastAsia="Times New Roman" w:cs="Times New Roman" w:csTheme="minorBidi"/>
+          <w:sz w:val="24"/>
+          <w:szCs w:val="22"/>
         </w:rPr>
         <w:t>Cadastur</w:t>
       </w:r>
-      <w:proofErr w:type="spellEnd"/>
       <w:r>
         <w:rPr>
-          <w:lang w:val="pt-BR"/>
+          <w:rFonts w:ascii="Times New Roman" w:hAnsi="Times New Roman" w:eastAsia="Times New Roman" w:cs="Times New Roman" w:csTheme="minorBidi"/>
+          <w:sz w:val="24"/>
+          <w:szCs w:val="22"/>
         </w:rPr>
         <w:t xml:space="preserve"> e da plataforma </w:t>
       </w:r>
-      <w:proofErr w:type="spellStart"/>
       <w:r>
         <w:rPr>
-          <w:lang w:val="pt-BR"/>
+          <w:rFonts w:ascii="Times New Roman" w:hAnsi="Times New Roman" w:eastAsia="Times New Roman" w:cs="Times New Roman" w:csTheme="minorBidi"/>
+          <w:sz w:val="24"/>
+          <w:szCs w:val="22"/>
         </w:rPr>
         <w:t>Airbnb</w:t>
       </w:r>
-      <w:proofErr w:type="spellEnd"/>
       <w:r>
         <w:rPr>
-          <w:lang w:val="pt-BR"/>
+          <w:rFonts w:ascii="Times New Roman" w:hAnsi="Times New Roman" w:eastAsia="Times New Roman" w:cs="Times New Roman" w:csTheme="minorBidi"/>
+          <w:sz w:val="24"/>
+          <w:szCs w:val="22"/>
         </w:rPr>
         <w:t xml:space="preserve"> registrem o fluxo turístico de forma generalista, sua aplicação nesta pesquisa foi delimitada geograficamente a esse universo ecológico e rural. Desse modo, tais registros operam como variáveis de proximidade (proxies) para capturar a infraestrutura de serviços, uma modelagem metodológica validada pela literatura de inteligência territorial diante da escassez de microdados governamentais estritos para a atividade camponesa (GUTTENTAG, 2015; MENDES FILHO et al., 2021).</w:t>
       </w:r>
@@ -297,55 +304,60 @@
       <w:pPr>
         <w:ind w:firstLine="420"/>
         <w:jc w:val="both"/>
-        <w:rPr>
-          <w:lang w:val="pt-BR"/>
-        </w:rPr>
       </w:pPr>
       <w:r>
         <w:rPr>
-          <w:lang w:val="pt-BR"/>
+          <w:rFonts w:ascii="Times New Roman" w:hAnsi="Times New Roman" w:eastAsia="Times New Roman" w:cs="Times New Roman" w:csTheme="minorBidi"/>
+          <w:sz w:val="24"/>
+          <w:szCs w:val="22"/>
         </w:rPr>
         <w:t>Para superar a invisibilidade estatística das dinâmicas informais no campo e capturar a real viabilidade das localidades, a matriz de dados foi estruturada em quatro dimensões analíticas interdependentes. A primeira dimensão é o Crédito e Fomento Financeiro, composta pelas operações de crédito rural (Pronaf) e microcrédito orientado obtidas via Sistema ESTECO do Banco Central do Brasil (BCB), acrescida de uma análise temporal de 8 anos dos repasses e contratos do Fundo Geral de Turismo (</w:t>
       </w:r>
-      <w:proofErr w:type="spellStart"/>
       <w:r>
         <w:rPr>
-          <w:lang w:val="pt-BR"/>
+          <w:rFonts w:ascii="Times New Roman" w:hAnsi="Times New Roman" w:eastAsia="Times New Roman" w:cs="Times New Roman" w:csTheme="minorBidi"/>
+          <w:sz w:val="24"/>
+          <w:szCs w:val="22"/>
         </w:rPr>
         <w:t>Fungetur</w:t>
       </w:r>
-      <w:proofErr w:type="spellEnd"/>
       <w:r>
         <w:rPr>
-          <w:lang w:val="pt-BR"/>
+          <w:rFonts w:ascii="Times New Roman" w:hAnsi="Times New Roman" w:eastAsia="Times New Roman" w:cs="Times New Roman" w:csTheme="minorBidi"/>
+          <w:sz w:val="24"/>
+          <w:szCs w:val="22"/>
         </w:rPr>
         <w:t>). Em seguida a Demanda e Dinâmica Digital, estimada por meio de variáveis de proximidade (proxies) de densidade de anúncios e fluxos de plataformas de economia compartilhada (</w:t>
       </w:r>
-      <w:proofErr w:type="spellStart"/>
       <w:r>
         <w:rPr>
-          <w:lang w:val="pt-BR"/>
+          <w:rFonts w:ascii="Times New Roman" w:hAnsi="Times New Roman" w:eastAsia="Times New Roman" w:cs="Times New Roman" w:csTheme="minorBidi"/>
+          <w:sz w:val="24"/>
+          <w:szCs w:val="22"/>
         </w:rPr>
         <w:t>Airbnb</w:t>
       </w:r>
-      <w:proofErr w:type="spellEnd"/>
       <w:r>
         <w:rPr>
-          <w:lang w:val="pt-BR"/>
+          <w:rFonts w:ascii="Times New Roman" w:hAnsi="Times New Roman" w:eastAsia="Times New Roman" w:cs="Times New Roman" w:csTheme="minorBidi"/>
+          <w:sz w:val="24"/>
+          <w:szCs w:val="22"/>
         </w:rPr>
         <w:t xml:space="preserve">), assumidas metodologicamente como indicadores da infraestrutura comercial instalada. Também a Estrutura Produtiva Local, mensurada através das Declarações de Aptidão ao Pronaf/CAF, registros de cooperativas ativas e prestadores homologados no </w:t>
       </w:r>
-      <w:proofErr w:type="spellStart"/>
       <w:r>
         <w:rPr>
-          <w:lang w:val="pt-BR"/>
+          <w:rFonts w:ascii="Times New Roman" w:hAnsi="Times New Roman" w:eastAsia="Times New Roman" w:cs="Times New Roman" w:csTheme="minorBidi"/>
+          <w:sz w:val="24"/>
+          <w:szCs w:val="22"/>
         </w:rPr>
         <w:t>Cadastur</w:t>
       </w:r>
-      <w:proofErr w:type="spellEnd"/>
       <w:r>
         <w:rPr>
-          <w:lang w:val="pt-BR"/>
+          <w:rFonts w:ascii="Times New Roman" w:hAnsi="Times New Roman" w:eastAsia="Times New Roman" w:cs="Times New Roman" w:csTheme="minorBidi"/>
+          <w:sz w:val="24"/>
+          <w:szCs w:val="22"/>
         </w:rPr>
         <w:t>, mapeando o grau de organização da base comunitária. Por fim a Vulnerabilidade e Conectividade, balizada por indicadores do Censo Demográfico do IBGE (rendimento e IDH-M) e mapas de cobertura de telecomunicações da Anatel, atuando como ponderadores de equidade social e viabilidade tecnológica.</w:t>
       </w:r>
@@ -354,34 +366,36 @@
       <w:pPr>
         <w:ind w:firstLine="420"/>
         <w:jc w:val="both"/>
-        <w:rPr>
-          <w:lang w:val="pt-BR"/>
-        </w:rPr>
       </w:pPr>
       <w:r>
         <w:rPr>
-          <w:lang w:val="pt-BR"/>
+          <w:rFonts w:ascii="Times New Roman" w:hAnsi="Times New Roman" w:eastAsia="Times New Roman" w:cs="Times New Roman" w:csTheme="minorBidi"/>
+          <w:sz w:val="24"/>
+          <w:szCs w:val="22"/>
         </w:rPr>
         <w:t>Para viabilizar a inserção dessas variáveis quantitativas no modelo de inteligência territorial e mitigar distorções causadas por municípios-polo de alta concentração, aplicou-</w:t>
       </w:r>
       <w:r>
         <w:rPr>
-          <w:lang w:val="pt-BR"/>
+          <w:rFonts w:ascii="Times New Roman" w:hAnsi="Times New Roman" w:eastAsia="Times New Roman" w:cs="Times New Roman" w:csTheme="minorBidi"/>
+          <w:sz w:val="24"/>
+          <w:szCs w:val="22"/>
         </w:rPr>
-        <w:lastRenderedPageBreak/>
         <w:t>se o procedimento estatístico de transformação logarítmica (Log-</w:t>
       </w:r>
-      <w:proofErr w:type="spellStart"/>
       <w:r>
         <w:rPr>
-          <w:lang w:val="pt-BR"/>
+          <w:rFonts w:ascii="Times New Roman" w:hAnsi="Times New Roman" w:eastAsia="Times New Roman" w:cs="Times New Roman" w:csTheme="minorBidi"/>
+          <w:sz w:val="24"/>
+          <w:szCs w:val="22"/>
         </w:rPr>
         <w:t>Transform</w:t>
       </w:r>
-      <w:proofErr w:type="spellEnd"/>
       <w:r>
         <w:rPr>
-          <w:lang w:val="pt-BR"/>
+          <w:rFonts w:ascii="Times New Roman" w:hAnsi="Times New Roman" w:eastAsia="Times New Roman" w:cs="Times New Roman" w:csTheme="minorBidi"/>
+          <w:sz w:val="24"/>
+          <w:szCs w:val="22"/>
         </w:rPr>
         <w:t>), operacionalizado em ambiente Python pela função np.log1p através da equação:</w:t>
       </w:r>
@@ -389,79 +403,45 @@
     <w:p>
       <w:pPr>
         <w:ind w:firstLine="420"/>
-        <w:jc w:val="both"/>
-        <w:rPr>
-          <w:lang w:val="pt-BR"/>
-        </w:rPr>
+        <w:jc w:val="center"/>
       </w:pPr>
-      <w:proofErr w:type="gramStart"/>
       <w:r>
         <w:rPr>
-          <w:lang w:val="pt-BR"/>
+          <w:rFonts w:ascii="Segoe WPC" w:cs="Segoe WPC"/>
+          <w:i/>
+          <w:iCs/>
+          <w:sz w:val="20"/>
+          <w:szCs w:val="20"/>
         </w:rPr>
-        <w:t>\(</w:t>
-      </w:r>
-      <w:proofErr w:type="gramEnd"/>
-      <w:r>
-        <w:rPr>
-          <w:lang w:val="pt-BR"/>
-        </w:rPr>
-        <w:t>Y=\</w:t>
-      </w:r>
-      <w:proofErr w:type="spellStart"/>
-      <w:r>
-        <w:rPr>
-          <w:lang w:val="pt-BR"/>
-        </w:rPr>
-        <w:t>ln</w:t>
-      </w:r>
-      <w:proofErr w:type="spellEnd"/>
-      <w:r>
-        <w:rPr>
-          <w:lang w:val="pt-BR"/>
-        </w:rPr>
-        <w:t xml:space="preserve"> (X+</w:t>
-      </w:r>
-      <w:proofErr w:type="gramStart"/>
-      <w:r>
-        <w:rPr>
-          <w:lang w:val="pt-BR"/>
-        </w:rPr>
-        <w:t>1)\</w:t>
-      </w:r>
-      <w:proofErr w:type="gramEnd"/>
-      <w:r>
-        <w:rPr>
-          <w:lang w:val="pt-BR"/>
-        </w:rPr>
-        <w:t>)</w:t>
+        <w:t>Y = ln(X + 1)</w:t>
       </w:r>
     </w:p>
     <w:p>
       <w:pPr>
         <w:ind w:firstLine="420"/>
         <w:jc w:val="both"/>
-        <w:rPr>
-          <w:lang w:val="pt-BR"/>
-        </w:rPr>
       </w:pPr>
       <w:r>
         <w:rPr>
-          <w:lang w:val="pt-BR"/>
+          <w:rFonts w:ascii="Times New Roman" w:hAnsi="Times New Roman" w:eastAsia="Times New Roman" w:cs="Times New Roman" w:csTheme="minorBidi"/>
+          <w:sz w:val="24"/>
+          <w:szCs w:val="22"/>
         </w:rPr>
         <w:t xml:space="preserve">A escolha dessa transformação fundamenta-se nas diretrizes econométricas de </w:t>
       </w:r>
-      <w:proofErr w:type="spellStart"/>
       <w:r>
         <w:rPr>
-          <w:lang w:val="pt-BR"/>
+          <w:rFonts w:ascii="Times New Roman" w:hAnsi="Times New Roman" w:eastAsia="Times New Roman" w:cs="Times New Roman" w:csTheme="minorBidi"/>
+          <w:sz w:val="24"/>
+          <w:szCs w:val="22"/>
         </w:rPr>
         <w:t>Gujarati</w:t>
       </w:r>
-      <w:proofErr w:type="spellEnd"/>
       <w:r>
         <w:rPr>
-          <w:lang w:val="pt-BR"/>
+          <w:rFonts w:ascii="Times New Roman" w:hAnsi="Times New Roman" w:eastAsia="Times New Roman" w:cs="Times New Roman" w:csTheme="minorBidi"/>
+          <w:sz w:val="24"/>
+          <w:szCs w:val="22"/>
         </w:rPr>
         <w:t xml:space="preserve"> e Porter (2011), em que o logaritmo natural atua como medida corretiva para mitigar a heterocedasticidade em distribuições socioeconômicas de corte transversal. A adição da constante unitária (+1) assegura a preservação dos valores nulos correspondentes à ausência de crédito ou anúncios em pequenas localidades sem gerar indeterminações matemáticas, visto que</w:t>
       </w:r>
@@ -469,59 +449,30 @@
     <w:p>
       <w:pPr>
         <w:ind w:firstLine="420"/>
-        <w:jc w:val="both"/>
-        <w:rPr>
-          <w:lang w:val="pt-BR"/>
-        </w:rPr>
+        <w:jc w:val="center"/>
       </w:pPr>
-      <w:proofErr w:type="gramStart"/>
       <w:r>
         <w:rPr>
-          <w:lang w:val="pt-BR"/>
+          <w:rFonts w:ascii="Segoe WPC" w:cs="Segoe WPC"/>
+          <w:i/>
+          <w:iCs/>
+          <w:sz w:val="20"/>
+          <w:szCs w:val="20"/>
         </w:rPr>
-        <w:t>\(</w:t>
-      </w:r>
-      <w:proofErr w:type="gramEnd"/>
-      <w:r>
-        <w:rPr>
-          <w:lang w:val="pt-BR"/>
-        </w:rPr>
-        <w:t>\</w:t>
-      </w:r>
-      <w:proofErr w:type="spellStart"/>
-      <w:proofErr w:type="gramStart"/>
-      <w:r>
-        <w:rPr>
-          <w:lang w:val="pt-BR"/>
-        </w:rPr>
-        <w:t>ln</w:t>
-      </w:r>
-      <w:proofErr w:type="spellEnd"/>
-      <w:r>
-        <w:rPr>
-          <w:lang w:val="pt-BR"/>
-        </w:rPr>
-        <w:t>(</w:t>
-      </w:r>
-      <w:proofErr w:type="gramEnd"/>
-      <w:r>
-        <w:rPr>
-          <w:lang w:val="pt-BR"/>
-        </w:rPr>
-        <w:t>0 + 1) = 0\).</w:t>
+        <w:t>ln(0 + 1) = 0</w:t>
       </w:r>
     </w:p>
+    <w:p/>
     <w:p>
       <w:pPr>
         <w:ind w:firstLine="420"/>
         <w:jc w:val="both"/>
-        <w:rPr>
-          <w:lang w:val="pt-BR"/>
-        </w:rPr>
       </w:pPr>
       <w:r>
         <w:rPr>
-          <w:lang w:val="pt-BR"/>
+          <w:rFonts w:ascii="Times New Roman" w:hAnsi="Times New Roman" w:eastAsia="Times New Roman" w:cs="Times New Roman" w:csTheme="minorBidi"/>
+          <w:sz w:val="24"/>
+          <w:szCs w:val="22"/>
         </w:rPr>
         <w:t>Na sequência, visando integrar variáveis de naturezas distintas em uma escala comum adimensional no intervalo contínuo de 0,0 a 1,0 (MENDES, 2026; MALCZEWSKI, 1999), aplicou-se a técnica de Normalização Min-Max:</w:t>
       </w:r>
@@ -529,141 +480,77 @@
     <w:p>
       <w:pPr>
         <w:ind w:firstLine="420"/>
-        <w:jc w:val="both"/>
-        <w:rPr>
-          <w:lang w:val="pt-BR"/>
-        </w:rPr>
+        <w:jc w:val="center"/>
       </w:pPr>
       <w:r>
         <w:rPr>
-          <w:lang w:val="pt-BR"/>
+          <w:rFonts w:ascii="Segoe WPC" w:cs="Segoe WPC"/>
+          <w:i/>
+          <w:iCs/>
+          <w:sz w:val="20"/>
+          <w:szCs w:val="20"/>
         </w:rPr>
-        <w:t>\(X_{</w:t>
-      </w:r>
-      <w:proofErr w:type="spellStart"/>
-      <w:r>
-        <w:rPr>
-          <w:lang w:val="pt-BR"/>
-        </w:rPr>
-        <w:t>norm</w:t>
-      </w:r>
-      <w:proofErr w:type="spellEnd"/>
-      <w:r>
-        <w:rPr>
-          <w:lang w:val="pt-BR"/>
-        </w:rPr>
-        <w:t>}=\</w:t>
-      </w:r>
-      <w:proofErr w:type="spellStart"/>
-      <w:r>
-        <w:rPr>
-          <w:lang w:val="pt-BR"/>
-        </w:rPr>
-        <w:t>frac</w:t>
-      </w:r>
-      <w:proofErr w:type="spellEnd"/>
-      <w:r>
-        <w:rPr>
-          <w:lang w:val="pt-BR"/>
-        </w:rPr>
-        <w:t>{X-X_{min</w:t>
-      </w:r>
-      <w:proofErr w:type="gramStart"/>
-      <w:r>
-        <w:rPr>
-          <w:lang w:val="pt-BR"/>
-        </w:rPr>
-        <w:t>}}{</w:t>
-      </w:r>
-      <w:proofErr w:type="gramEnd"/>
-      <w:r>
-        <w:rPr>
-          <w:lang w:val="pt-BR"/>
-        </w:rPr>
-        <w:t>X_{</w:t>
-      </w:r>
-      <w:proofErr w:type="spellStart"/>
-      <w:r>
-        <w:rPr>
-          <w:lang w:val="pt-BR"/>
-        </w:rPr>
-        <w:t>max</w:t>
-      </w:r>
-      <w:proofErr w:type="spellEnd"/>
-      <w:r>
-        <w:rPr>
-          <w:lang w:val="pt-BR"/>
-        </w:rPr>
-        <w:t>}-X_{min</w:t>
-      </w:r>
-      <w:proofErr w:type="gramStart"/>
-      <w:r>
-        <w:rPr>
-          <w:lang w:val="pt-BR"/>
-        </w:rPr>
-        <w:t>}}\</w:t>
-      </w:r>
-      <w:proofErr w:type="gramEnd"/>
-      <w:r>
-        <w:rPr>
-          <w:lang w:val="pt-BR"/>
-        </w:rPr>
-        <w:t>)</w:t>
+        <w:t>Xnorm = (X - Xmin) / (Xmax - Xmin</w:t>
       </w:r>
     </w:p>
     <w:p>
       <w:pPr>
         <w:ind w:firstLine="420"/>
         <w:jc w:val="both"/>
-        <w:rPr>
-          <w:lang w:val="pt-BR"/>
-        </w:rPr>
       </w:pPr>
       <w:r>
         <w:rPr>
-          <w:lang w:val="pt-BR"/>
+          <w:rFonts w:ascii="Times New Roman" w:hAnsi="Times New Roman" w:eastAsia="Times New Roman" w:cs="Times New Roman" w:csTheme="minorBidi"/>
+          <w:sz w:val="24"/>
+          <w:szCs w:val="22"/>
         </w:rPr>
         <w:t xml:space="preserve">Para responder à tese de universalidade do modelo sem desconsiderar os desequilíbrios federativos, a normalização foi processada em duas camadas complementares: uma escala </w:t>
       </w:r>
-      <w:proofErr w:type="spellStart"/>
       <w:r>
         <w:rPr>
-          <w:lang w:val="pt-BR"/>
+          <w:rFonts w:ascii="Times New Roman" w:hAnsi="Times New Roman" w:eastAsia="Times New Roman" w:cs="Times New Roman" w:csTheme="minorBidi"/>
+          <w:sz w:val="24"/>
+          <w:szCs w:val="22"/>
         </w:rPr>
         <w:t>Intra-Estado</w:t>
       </w:r>
-      <w:proofErr w:type="spellEnd"/>
       <w:r>
         <w:rPr>
-          <w:lang w:val="pt-BR"/>
+          <w:rFonts w:ascii="Times New Roman" w:hAnsi="Times New Roman" w:eastAsia="Times New Roman" w:cs="Times New Roman" w:csTheme="minorBidi"/>
+          <w:sz w:val="24"/>
+          <w:szCs w:val="22"/>
         </w:rPr>
         <w:t xml:space="preserve"> (utilizando o argumento </w:t>
       </w:r>
-      <w:proofErr w:type="spellStart"/>
       <w:r>
         <w:rPr>
-          <w:lang w:val="pt-BR"/>
+          <w:rFonts w:ascii="Times New Roman" w:hAnsi="Times New Roman" w:eastAsia="Times New Roman" w:cs="Times New Roman" w:csTheme="minorBidi"/>
+          <w:sz w:val="24"/>
+          <w:szCs w:val="22"/>
         </w:rPr>
         <w:t>groupby</w:t>
       </w:r>
-      <w:proofErr w:type="spellEnd"/>
       <w:r>
         <w:rPr>
-          <w:lang w:val="pt-BR"/>
+          <w:rFonts w:ascii="Times New Roman" w:hAnsi="Times New Roman" w:eastAsia="Times New Roman" w:cs="Times New Roman" w:csTheme="minorBidi"/>
+          <w:sz w:val="24"/>
+          <w:szCs w:val="22"/>
         </w:rPr>
         <w:t>('uf') em Python) para calibrar os limites internos face à teoria da heterogeneidade estrutural cepalina (PORCILE, 2011; PINTO, 1970), e uma escala Global/</w:t>
       </w:r>
-      <w:proofErr w:type="spellStart"/>
       <w:r>
         <w:rPr>
-          <w:lang w:val="pt-BR"/>
+          <w:rFonts w:ascii="Times New Roman" w:hAnsi="Times New Roman" w:eastAsia="Times New Roman" w:cs="Times New Roman" w:csTheme="minorBidi"/>
+          <w:sz w:val="24"/>
+          <w:szCs w:val="22"/>
         </w:rPr>
         <w:t>Inter-Estado</w:t>
       </w:r>
-      <w:proofErr w:type="spellEnd"/>
       <w:r>
         <w:rPr>
-          <w:lang w:val="pt-BR"/>
+          <w:rFonts w:ascii="Times New Roman" w:hAnsi="Times New Roman" w:eastAsia="Times New Roman" w:cs="Times New Roman" w:csTheme="minorBidi"/>
+          <w:sz w:val="24"/>
+          <w:szCs w:val="22"/>
         </w:rPr>
         <w:t>, permitindo o confronto direto entre as capacidades macroeconômicas do Sul e do Nordeste.</w:t>
       </w:r>
@@ -672,125 +559,140 @@
       <w:pPr>
         <w:ind w:firstLine="420"/>
         <w:jc w:val="both"/>
-        <w:rPr>
-          <w:lang w:val="pt-BR"/>
-        </w:rPr>
       </w:pPr>
       <w:r>
         <w:rPr>
-          <w:lang w:val="pt-BR"/>
+          <w:rFonts w:ascii="Times New Roman" w:hAnsi="Times New Roman" w:eastAsia="Times New Roman" w:cs="Times New Roman" w:csTheme="minorBidi"/>
+          <w:sz w:val="24"/>
+          <w:szCs w:val="22"/>
         </w:rPr>
         <w:t>A modelagem de tomada de decisão seguiu um arranjo metodológico integrado em dois estágios sucessivos para evitar vieses de transição matemática. No primeiro estágio, utilizou-se o algoritmo do Processo de Hierarquia Analítica (</w:t>
       </w:r>
-      <w:proofErr w:type="spellStart"/>
       <w:r>
         <w:rPr>
-          <w:lang w:val="pt-BR"/>
+          <w:rFonts w:ascii="Times New Roman" w:hAnsi="Times New Roman" w:eastAsia="Times New Roman" w:cs="Times New Roman" w:csTheme="minorBidi"/>
+          <w:sz w:val="24"/>
+          <w:szCs w:val="22"/>
         </w:rPr>
         <w:t>Analytic</w:t>
       </w:r>
-      <w:proofErr w:type="spellEnd"/>
       <w:r>
         <w:rPr>
-          <w:lang w:val="pt-BR"/>
+          <w:rFonts w:ascii="Times New Roman" w:hAnsi="Times New Roman" w:eastAsia="Times New Roman" w:cs="Times New Roman" w:csTheme="minorBidi"/>
+          <w:sz w:val="24"/>
+          <w:szCs w:val="22"/>
         </w:rPr>
         <w:t xml:space="preserve"> </w:t>
       </w:r>
-      <w:proofErr w:type="spellStart"/>
       <w:r>
         <w:rPr>
-          <w:lang w:val="pt-BR"/>
+          <w:rFonts w:ascii="Times New Roman" w:hAnsi="Times New Roman" w:eastAsia="Times New Roman" w:cs="Times New Roman" w:csTheme="minorBidi"/>
+          <w:sz w:val="24"/>
+          <w:szCs w:val="22"/>
         </w:rPr>
         <w:t>Hierarchy</w:t>
       </w:r>
-      <w:proofErr w:type="spellEnd"/>
       <w:r>
         <w:rPr>
-          <w:lang w:val="pt-BR"/>
+          <w:rFonts w:ascii="Times New Roman" w:hAnsi="Times New Roman" w:eastAsia="Times New Roman" w:cs="Times New Roman" w:csTheme="minorBidi"/>
+          <w:sz w:val="24"/>
+          <w:szCs w:val="22"/>
         </w:rPr>
         <w:t xml:space="preserve"> </w:t>
       </w:r>
-      <w:proofErr w:type="spellStart"/>
       <w:r>
         <w:rPr>
-          <w:lang w:val="pt-BR"/>
+          <w:rFonts w:ascii="Times New Roman" w:hAnsi="Times New Roman" w:eastAsia="Times New Roman" w:cs="Times New Roman" w:csTheme="minorBidi"/>
+          <w:sz w:val="24"/>
+          <w:szCs w:val="22"/>
         </w:rPr>
         <w:t>Process</w:t>
       </w:r>
-      <w:proofErr w:type="spellEnd"/>
       <w:r>
         <w:rPr>
-          <w:lang w:val="pt-BR"/>
+          <w:rFonts w:ascii="Times New Roman" w:hAnsi="Times New Roman" w:eastAsia="Times New Roman" w:cs="Times New Roman" w:csTheme="minorBidi"/>
+          <w:sz w:val="24"/>
+          <w:szCs w:val="22"/>
         </w:rPr>
         <w:t xml:space="preserve"> - AHP) para a calibração de pesos dos critérios a partir de julgamentos estruturados, gerando o score final do Índice Sintético de Viabilidade Territorial (ISVT) para cada município. No segundo estágio, os scores consolidados do ISVT foram submetidos à Análise Espacial de Dados de Área (AEDA) por meio do Índice de Moran Local (Local </w:t>
       </w:r>
-      <w:proofErr w:type="spellStart"/>
       <w:r>
         <w:rPr>
-          <w:lang w:val="pt-BR"/>
+          <w:rFonts w:ascii="Times New Roman" w:hAnsi="Times New Roman" w:eastAsia="Times New Roman" w:cs="Times New Roman" w:csTheme="minorBidi"/>
+          <w:sz w:val="24"/>
+          <w:szCs w:val="22"/>
         </w:rPr>
         <w:t>Indicators</w:t>
       </w:r>
-      <w:proofErr w:type="spellEnd"/>
       <w:r>
         <w:rPr>
-          <w:lang w:val="pt-BR"/>
+          <w:rFonts w:ascii="Times New Roman" w:hAnsi="Times New Roman" w:eastAsia="Times New Roman" w:cs="Times New Roman" w:csTheme="minorBidi"/>
+          <w:sz w:val="24"/>
+          <w:szCs w:val="22"/>
         </w:rPr>
         <w:t xml:space="preserve"> </w:t>
       </w:r>
-      <w:proofErr w:type="spellStart"/>
       <w:r>
         <w:rPr>
-          <w:lang w:val="pt-BR"/>
+          <w:rFonts w:ascii="Times New Roman" w:hAnsi="Times New Roman" w:eastAsia="Times New Roman" w:cs="Times New Roman" w:csTheme="minorBidi"/>
+          <w:sz w:val="24"/>
+          <w:szCs w:val="22"/>
         </w:rPr>
         <w:t>of</w:t>
       </w:r>
-      <w:proofErr w:type="spellEnd"/>
       <w:r>
         <w:rPr>
-          <w:lang w:val="pt-BR"/>
+          <w:rFonts w:ascii="Times New Roman" w:hAnsi="Times New Roman" w:eastAsia="Times New Roman" w:cs="Times New Roman" w:csTheme="minorBidi"/>
+          <w:sz w:val="24"/>
+          <w:szCs w:val="22"/>
         </w:rPr>
         <w:t xml:space="preserve"> </w:t>
       </w:r>
-      <w:proofErr w:type="spellStart"/>
       <w:r>
         <w:rPr>
-          <w:lang w:val="pt-BR"/>
+          <w:rFonts w:ascii="Times New Roman" w:hAnsi="Times New Roman" w:eastAsia="Times New Roman" w:cs="Times New Roman" w:csTheme="minorBidi"/>
+          <w:sz w:val="24"/>
+          <w:szCs w:val="22"/>
         </w:rPr>
         <w:t>Spatial</w:t>
       </w:r>
-      <w:proofErr w:type="spellEnd"/>
       <w:r>
         <w:rPr>
-          <w:lang w:val="pt-BR"/>
+          <w:rFonts w:ascii="Times New Roman" w:hAnsi="Times New Roman" w:eastAsia="Times New Roman" w:cs="Times New Roman" w:csTheme="minorBidi"/>
+          <w:sz w:val="24"/>
+          <w:szCs w:val="22"/>
         </w:rPr>
         <w:t xml:space="preserve"> </w:t>
       </w:r>
-      <w:proofErr w:type="spellStart"/>
       <w:r>
         <w:rPr>
-          <w:lang w:val="pt-BR"/>
+          <w:rFonts w:ascii="Times New Roman" w:hAnsi="Times New Roman" w:eastAsia="Times New Roman" w:cs="Times New Roman" w:csTheme="minorBidi"/>
+          <w:sz w:val="24"/>
+          <w:szCs w:val="22"/>
         </w:rPr>
         <w:t>Association</w:t>
       </w:r>
-      <w:proofErr w:type="spellEnd"/>
       <w:r>
         <w:rPr>
-          <w:lang w:val="pt-BR"/>
+          <w:rFonts w:ascii="Times New Roman" w:hAnsi="Times New Roman" w:eastAsia="Times New Roman" w:cs="Times New Roman" w:csTheme="minorBidi"/>
+          <w:sz w:val="24"/>
+          <w:szCs w:val="22"/>
         </w:rPr>
         <w:t xml:space="preserve"> - LISA), </w:t>
       </w:r>
-      <w:proofErr w:type="spellStart"/>
       <w:r>
         <w:rPr>
-          <w:lang w:val="pt-BR"/>
+          <w:rFonts w:ascii="Times New Roman" w:hAnsi="Times New Roman" w:eastAsia="Times New Roman" w:cs="Times New Roman" w:csTheme="minorBidi"/>
+          <w:sz w:val="24"/>
+          <w:szCs w:val="22"/>
         </w:rPr>
         <w:t>Anselin</w:t>
       </w:r>
-      <w:proofErr w:type="spellEnd"/>
       <w:r>
         <w:rPr>
-          <w:lang w:val="pt-BR"/>
+          <w:rFonts w:ascii="Times New Roman" w:hAnsi="Times New Roman" w:eastAsia="Times New Roman" w:cs="Times New Roman" w:csTheme="minorBidi"/>
+          <w:sz w:val="24"/>
+          <w:szCs w:val="22"/>
         </w:rPr>
         <w:t xml:space="preserve"> (1995). Essa arquitetura metodológica baseia-se na decomposição de indicadores globais de autocorrelação para identificar padrões locais de associação e heterogeneidade espacial (ANSELIN, 1995), permitindo que o ISVT identifique numericamente as assimetrias distributivas.</w:t>
       </w:r>
@@ -799,21 +701,21 @@
       <w:pPr>
         <w:ind w:firstLine="420"/>
         <w:jc w:val="both"/>
-        <w:rPr>
-          <w:lang w:val="pt-BR"/>
-        </w:rPr>
       </w:pPr>
       <w:r>
         <w:rPr>
-          <w:lang w:val="pt-BR"/>
+          <w:rFonts w:ascii="Times New Roman" w:hAnsi="Times New Roman" w:eastAsia="Times New Roman" w:cs="Times New Roman" w:csTheme="minorBidi"/>
+          <w:sz w:val="24"/>
+          <w:szCs w:val="22"/>
         </w:rPr>
         <w:t xml:space="preserve">Essa arquitetura metodológica permite que o ISVT identifique numericamente as assimetrias distributivas e os "vazios financeiros" — municípios com forte apelo endógeno e infraestrutura latente, mas desprovidos de liquidez —, enquanto o algoritmo LISA espacializa esses descasamentos na forma de clusters geográficos de intervenção prioritária. Por fim, assume-se como limitação do modelo a impossibilidade de capturar fluxos </w:t>
       </w:r>
       <w:r>
         <w:rPr>
-          <w:lang w:val="pt-BR"/>
+          <w:rFonts w:ascii="Times New Roman" w:hAnsi="Times New Roman" w:eastAsia="Times New Roman" w:cs="Times New Roman" w:csTheme="minorBidi"/>
+          <w:sz w:val="24"/>
+          <w:szCs w:val="22"/>
         </w:rPr>
-        <w:lastRenderedPageBreak/>
         <w:t>financeiros privados não monitorados pelo ecossistema do BCB, bem como a sensibilidade do índice a choques climáticos agudos de curto prazo (secas prolongadas na Bahia ou enchentes severas no Rio Grande do Sul), os quais introduzem volatilidades exógenas nas cadeias produtivas analisadas.</w:t>
       </w:r>
     </w:p>
@@ -821,18 +723,12 @@
       <w:pPr>
         <w:ind w:firstLine="420"/>
         <w:jc w:val="both"/>
-        <w:rPr>
-          <w:lang w:val="pt-BR"/>
-        </w:rPr>
       </w:pPr>
     </w:p>
     <w:p>
       <w:pPr>
         <w:ind w:firstLine="420"/>
         <w:jc w:val="both"/>
-        <w:rPr>
-          <w:lang w:val="pt-BR"/>
-        </w:rPr>
       </w:pPr>
     </w:p>
     <w:p>
@@ -841,9 +737,19 @@
         <w:jc w:val="both"/>
       </w:pPr>
       <w:r>
+        <w:rPr>
+          <w:rFonts w:ascii="Times New Roman" w:hAnsi="Times New Roman" w:eastAsia="Times New Roman" w:cs="Times New Roman" w:csTheme="minorBidi"/>
+          <w:sz w:val="24"/>
+          <w:szCs w:val="22"/>
+        </w:rPr>
         <w:t>R</w:t>
       </w:r>
       <w:r>
+        <w:rPr>
+          <w:rFonts w:ascii="Times New Roman" w:hAnsi="Times New Roman" w:eastAsia="Times New Roman" w:cs="Times New Roman" w:csTheme="minorBidi"/>
+          <w:sz w:val="24"/>
+          <w:szCs w:val="22"/>
+        </w:rPr>
         <w:t>EFERÊNCIAS</w:t>
       </w:r>
     </w:p>
@@ -851,16 +757,20 @@
       <w:pPr>
         <w:ind w:firstLine="420"/>
         <w:jc w:val="both"/>
-        <w:rPr>
-          <w:lang w:val="pt-BR"/>
-        </w:rPr>
       </w:pPr>
       <w:r>
+        <w:rPr>
+          <w:rFonts w:ascii="Times New Roman" w:hAnsi="Times New Roman" w:eastAsia="Times New Roman" w:cs="Times New Roman" w:csTheme="minorBidi"/>
+          <w:sz w:val="24"/>
+          <w:szCs w:val="22"/>
+        </w:rPr>
         <w:t xml:space="preserve">ANSELIN, Luc. Local Indicators of Spatial Association—LISA. Geographical Analysis, v. 27, n. 2, p. 93-115, 1995. </w:t>
       </w:r>
       <w:r>
         <w:rPr>
-          <w:lang w:val="pt-BR"/>
+          <w:rFonts w:ascii="Times New Roman" w:hAnsi="Times New Roman" w:eastAsia="Times New Roman" w:cs="Times New Roman" w:csTheme="minorBidi"/>
+          <w:sz w:val="24"/>
+          <w:szCs w:val="22"/>
         </w:rPr>
         <w:t>Disponível em: https://onlinelibrary.wiley.com/doi/abs/10.1111/j.1538-4632.1995.tb00338.x. Acesso em: 13 set. 2026.</w:t>
       </w:r>
@@ -869,27 +779,28 @@
       <w:pPr>
         <w:ind w:firstLine="420"/>
         <w:jc w:val="both"/>
-        <w:rPr>
-          <w:lang w:val="pt-BR"/>
-        </w:rPr>
       </w:pPr>
       <w:r>
         <w:rPr>
-          <w:lang w:val="pt-BR"/>
+          <w:rFonts w:ascii="Times New Roman" w:hAnsi="Times New Roman" w:eastAsia="Times New Roman" w:cs="Times New Roman" w:csTheme="minorBidi"/>
+          <w:sz w:val="24"/>
+          <w:szCs w:val="22"/>
         </w:rPr>
         <w:t>BARTHOLO, Roberto; SANSOLO, Davis Gruber; BURSZTYN, Ivan (</w:t>
       </w:r>
-      <w:proofErr w:type="spellStart"/>
       <w:r>
         <w:rPr>
-          <w:lang w:val="pt-BR"/>
+          <w:rFonts w:ascii="Times New Roman" w:hAnsi="Times New Roman" w:eastAsia="Times New Roman" w:cs="Times New Roman" w:csTheme="minorBidi"/>
+          <w:sz w:val="24"/>
+          <w:szCs w:val="22"/>
         </w:rPr>
         <w:t>Orgs</w:t>
       </w:r>
-      <w:proofErr w:type="spellEnd"/>
       <w:r>
         <w:rPr>
-          <w:lang w:val="pt-BR"/>
+          <w:rFonts w:ascii="Times New Roman" w:hAnsi="Times New Roman" w:eastAsia="Times New Roman" w:cs="Times New Roman" w:csTheme="minorBidi"/>
+          <w:sz w:val="24"/>
+          <w:szCs w:val="22"/>
         </w:rPr>
         <w:t>.). Turismo de Base Comunitária: diversidade de olhares e experiências brasileiras. Rio de Janeiro: Letra e Imagem, 2009. 460 p.</w:t>
       </w:r>
@@ -898,13 +809,12 @@
       <w:pPr>
         <w:ind w:firstLine="420"/>
         <w:jc w:val="both"/>
-        <w:rPr>
-          <w:lang w:val="pt-BR"/>
-        </w:rPr>
       </w:pPr>
       <w:r>
         <w:rPr>
-          <w:lang w:val="pt-BR"/>
+          <w:rFonts w:ascii="Times New Roman" w:hAnsi="Times New Roman" w:eastAsia="Times New Roman" w:cs="Times New Roman" w:csTheme="minorBidi"/>
+          <w:sz w:val="24"/>
+          <w:szCs w:val="22"/>
         </w:rPr>
         <w:t>BOLZÁN, Ricardo; MENDES FILHO, Luiz. Gestão turística inteligente e datificação: Design de plataformas digitais no turismo através da lente da justiça de dados. Revista de Turismo Contemporâneo, v. 12, n. 2, p. 1-22, 2024.</w:t>
       </w:r>
@@ -913,27 +823,28 @@
       <w:pPr>
         <w:ind w:firstLine="420"/>
         <w:jc w:val="both"/>
-        <w:rPr>
-          <w:lang w:val="pt-BR"/>
-        </w:rPr>
       </w:pPr>
       <w:r>
         <w:rPr>
-          <w:lang w:val="pt-BR"/>
+          <w:rFonts w:ascii="Times New Roman" w:hAnsi="Times New Roman" w:eastAsia="Times New Roman" w:cs="Times New Roman" w:csTheme="minorBidi"/>
+          <w:sz w:val="24"/>
+          <w:szCs w:val="22"/>
         </w:rPr>
         <w:t xml:space="preserve">BRASIL. Lei nº 14.978, de 18 de setembro de 2024. Altera as Leis </w:t>
       </w:r>
-      <w:proofErr w:type="spellStart"/>
       <w:r>
         <w:rPr>
-          <w:lang w:val="pt-BR"/>
+          <w:rFonts w:ascii="Times New Roman" w:hAnsi="Times New Roman" w:eastAsia="Times New Roman" w:cs="Times New Roman" w:csTheme="minorBidi"/>
+          <w:sz w:val="24"/>
+          <w:szCs w:val="22"/>
         </w:rPr>
         <w:t>nºs</w:t>
       </w:r>
-      <w:proofErr w:type="spellEnd"/>
       <w:r>
         <w:rPr>
-          <w:lang w:val="pt-BR"/>
+          <w:rFonts w:ascii="Times New Roman" w:hAnsi="Times New Roman" w:eastAsia="Times New Roman" w:cs="Times New Roman" w:csTheme="minorBidi"/>
+          <w:sz w:val="24"/>
+          <w:szCs w:val="22"/>
         </w:rPr>
         <w:t xml:space="preserve"> 7.064, de 6 de dezembro de 1982, 7.565, de 19 de dezembro de 1986 (Código Brasileiro de Aeronáutica), 11.771, de 17 de setembro de 2008 (Lei Geral do Turismo), para promover a modernização do turismo. Brasília, DF: Presidência da República, [2024]. Disponível em: http://www.planalto.gov.br/ccivil_03/_ato2023-2026/2024/lei/l14978.htm. Acesso em: 13 set. 2026.</w:t>
       </w:r>
@@ -942,13 +853,12 @@
       <w:pPr>
         <w:ind w:firstLine="420"/>
         <w:jc w:val="both"/>
-        <w:rPr>
-          <w:lang w:val="pt-BR"/>
-        </w:rPr>
       </w:pPr>
       <w:r>
         <w:rPr>
-          <w:lang w:val="pt-BR"/>
+          <w:rFonts w:ascii="Times New Roman" w:hAnsi="Times New Roman" w:eastAsia="Times New Roman" w:cs="Times New Roman" w:csTheme="minorBidi"/>
+          <w:sz w:val="24"/>
+          <w:szCs w:val="22"/>
         </w:rPr>
         <w:t>BRASIL. Ministério do Turismo. Portaria MTur nº 1, de 30 de janeiro de 2026. Dispõe sobre as normas do Programa de Regionalização do Turismo, do Mapa do Turismo Brasileiro e da Categorização dos Municípios no Mapa do Turismo Brasileiro. Diário Oficial da União: seção 1, Brasília, DF, ano 2026. Disponível em: https://www.gov.br/turismo/pt-br/centrais-de-conteudo-/publicacoes/atos-normativos-2/2026/portaria-mtur-no-1-de-30-de-janeiro-de-2026. Acesso em: 13 set. 2026.</w:t>
       </w:r>
@@ -957,13 +867,12 @@
       <w:pPr>
         <w:ind w:firstLine="420"/>
         <w:jc w:val="both"/>
-        <w:rPr>
-          <w:lang w:val="pt-BR"/>
-        </w:rPr>
       </w:pPr>
       <w:r>
         <w:rPr>
-          <w:lang w:val="pt-BR"/>
+          <w:rFonts w:ascii="Times New Roman" w:hAnsi="Times New Roman" w:eastAsia="Times New Roman" w:cs="Times New Roman" w:csTheme="minorBidi"/>
+          <w:sz w:val="24"/>
+          <w:szCs w:val="22"/>
         </w:rPr>
         <w:t>BREGOLIN, Marta. Inteligência territorial em turismo: aplicação do Sistema de Capitais para análise de observatórios de turismo da Europa e da América Latina. 2018. 240 f. Tese (Doutorado em Administração) – Pontifícia Universidade Católica do Rio Grande do Sul, Porto Alegre, 2018.</w:t>
       </w:r>
@@ -972,15 +881,14 @@
       <w:pPr>
         <w:ind w:firstLine="420"/>
         <w:jc w:val="both"/>
-        <w:rPr>
-          <w:lang w:val="pt-BR"/>
-        </w:rPr>
       </w:pPr>
       <w:r>
+        <w:lastRenderedPageBreak/>
         <w:rPr>
-          <w:lang w:val="pt-BR"/>
+          <w:rFonts w:ascii="Times New Roman" w:hAnsi="Times New Roman" w:eastAsia="Times New Roman" w:cs="Times New Roman" w:csTheme="minorBidi"/>
+          <w:sz w:val="24"/>
+          <w:szCs w:val="22"/>
         </w:rPr>
-        <w:lastRenderedPageBreak/>
         <w:t>CAETANO, Jean Gilberto; WEGNER, Douglas; Xavier, Thiago Reis. Fatores de desenvolvimento regional do turismo: um estudo de caso em um circuito de cicloturismo no Brasil. Revista Ciências Administrativas, Fortaleza, v. 29, p. 1-15, 2023.</w:t>
       </w:r>
     </w:p>
@@ -988,27 +896,28 @@
       <w:pPr>
         <w:ind w:firstLine="420"/>
         <w:jc w:val="both"/>
-        <w:rPr>
-          <w:lang w:val="pt-BR"/>
-        </w:rPr>
       </w:pPr>
       <w:r>
         <w:rPr>
-          <w:lang w:val="pt-BR"/>
+          <w:rFonts w:ascii="Times New Roman" w:hAnsi="Times New Roman" w:eastAsia="Times New Roman" w:cs="Times New Roman" w:csTheme="minorBidi"/>
+          <w:sz w:val="24"/>
+          <w:szCs w:val="22"/>
         </w:rPr>
         <w:t>CORIOLANO, Valdir Augusto. O turismo comunitário no Nordeste brasileiro. In: BARTHOLO, Roberto; SANSOLO, Davis Gruber; BURSZTYN, Ivan (</w:t>
       </w:r>
-      <w:proofErr w:type="spellStart"/>
       <w:r>
         <w:rPr>
-          <w:lang w:val="pt-BR"/>
+          <w:rFonts w:ascii="Times New Roman" w:hAnsi="Times New Roman" w:eastAsia="Times New Roman" w:cs="Times New Roman" w:csTheme="minorBidi"/>
+          <w:sz w:val="24"/>
+          <w:szCs w:val="22"/>
         </w:rPr>
         <w:t>Orgs</w:t>
       </w:r>
-      <w:proofErr w:type="spellEnd"/>
       <w:r>
         <w:rPr>
-          <w:lang w:val="pt-BR"/>
+          <w:rFonts w:ascii="Times New Roman" w:hAnsi="Times New Roman" w:eastAsia="Times New Roman" w:cs="Times New Roman" w:csTheme="minorBidi"/>
+          <w:sz w:val="24"/>
+          <w:szCs w:val="22"/>
         </w:rPr>
         <w:t>.). Turismo de Base Comunitária: diversidade de olhares e experiências brasileiras. Rio de Janeiro: Letra e Imagem, 2009. p. 291-303.</w:t>
       </w:r>
@@ -1017,41 +926,44 @@
       <w:pPr>
         <w:ind w:firstLine="420"/>
         <w:jc w:val="both"/>
-        <w:rPr>
-          <w:lang w:val="pt-BR"/>
-        </w:rPr>
       </w:pPr>
       <w:r>
         <w:rPr>
-          <w:lang w:val="pt-BR"/>
+          <w:rFonts w:ascii="Times New Roman" w:hAnsi="Times New Roman" w:eastAsia="Times New Roman" w:cs="Times New Roman" w:csTheme="minorBidi"/>
+          <w:sz w:val="24"/>
+          <w:szCs w:val="22"/>
         </w:rPr>
         <w:t xml:space="preserve">CRUZ, Rita de Cássia </w:t>
       </w:r>
-      <w:proofErr w:type="spellStart"/>
       <w:r>
         <w:rPr>
-          <w:lang w:val="pt-BR"/>
+          <w:rFonts w:ascii="Times New Roman" w:hAnsi="Times New Roman" w:eastAsia="Times New Roman" w:cs="Times New Roman" w:csTheme="minorBidi"/>
+          <w:sz w:val="24"/>
+          <w:szCs w:val="22"/>
         </w:rPr>
         <w:t>Ariza</w:t>
       </w:r>
-      <w:proofErr w:type="spellEnd"/>
       <w:r>
         <w:rPr>
-          <w:lang w:val="pt-BR"/>
+          <w:rFonts w:ascii="Times New Roman" w:hAnsi="Times New Roman" w:eastAsia="Times New Roman" w:cs="Times New Roman" w:csTheme="minorBidi"/>
+          <w:sz w:val="24"/>
+          <w:szCs w:val="22"/>
         </w:rPr>
         <w:t xml:space="preserve"> da. Turismo, produção do espaço e desenvolvimento desigual: para pensar a realidade brasileira. In: BARTHOLO, Roberto; SANSOLO, Davis Gruber; BURSZTYN, Ivan (</w:t>
       </w:r>
-      <w:proofErr w:type="spellStart"/>
       <w:r>
         <w:rPr>
-          <w:lang w:val="pt-BR"/>
+          <w:rFonts w:ascii="Times New Roman" w:hAnsi="Times New Roman" w:eastAsia="Times New Roman" w:cs="Times New Roman" w:csTheme="minorBidi"/>
+          <w:sz w:val="24"/>
+          <w:szCs w:val="22"/>
         </w:rPr>
         <w:t>Orgs</w:t>
       </w:r>
-      <w:proofErr w:type="spellEnd"/>
       <w:r>
         <w:rPr>
-          <w:lang w:val="pt-BR"/>
+          <w:rFonts w:ascii="Times New Roman" w:hAnsi="Times New Roman" w:eastAsia="Times New Roman" w:cs="Times New Roman" w:csTheme="minorBidi"/>
+          <w:sz w:val="24"/>
+          <w:szCs w:val="22"/>
         </w:rPr>
         <w:t>.). Turismo de Base Comunitária: diversidade de olhares e experiências brasileiras. Rio de Janeiro: Letra e Imagem, 2009. p. 55-67.</w:t>
       </w:r>
@@ -1063,25 +975,34 @@
       </w:pPr>
       <w:r>
         <w:rPr>
-          <w:lang w:val="pt-BR"/>
+          <w:rFonts w:ascii="Times New Roman" w:hAnsi="Times New Roman" w:eastAsia="Times New Roman" w:cs="Times New Roman" w:csTheme="minorBidi"/>
+          <w:sz w:val="24"/>
+          <w:szCs w:val="22"/>
         </w:rPr>
         <w:t xml:space="preserve">GUJARATI, </w:t>
       </w:r>
-      <w:proofErr w:type="spellStart"/>
       <w:r>
         <w:rPr>
-          <w:lang w:val="pt-BR"/>
+          <w:rFonts w:ascii="Times New Roman" w:hAnsi="Times New Roman" w:eastAsia="Times New Roman" w:cs="Times New Roman" w:csTheme="minorBidi"/>
+          <w:sz w:val="24"/>
+          <w:szCs w:val="22"/>
         </w:rPr>
         <w:t>Damodar</w:t>
       </w:r>
-      <w:proofErr w:type="spellEnd"/>
       <w:r>
         <w:rPr>
-          <w:lang w:val="pt-BR"/>
+          <w:rFonts w:ascii="Times New Roman" w:hAnsi="Times New Roman" w:eastAsia="Times New Roman" w:cs="Times New Roman" w:csTheme="minorBidi"/>
+          <w:sz w:val="24"/>
+          <w:szCs w:val="22"/>
         </w:rPr>
         <w:t xml:space="preserve"> N.; PORTER, Dawn C. Econometria Básica. 5. ed. Porto Alegre: AMGH Editora, 2011. </w:t>
       </w:r>
       <w:r>
+        <w:rPr>
+          <w:rFonts w:ascii="Times New Roman" w:hAnsi="Times New Roman" w:eastAsia="Times New Roman" w:cs="Times New Roman" w:csTheme="minorBidi"/>
+          <w:sz w:val="24"/>
+          <w:szCs w:val="22"/>
+        </w:rPr>
         <w:t>924 p. ISBN 9788563308320.</w:t>
       </w:r>
     </w:p>
@@ -1089,52 +1010,60 @@
       <w:pPr>
         <w:ind w:firstLine="420"/>
         <w:jc w:val="both"/>
-        <w:rPr>
-          <w:lang w:val="pt-BR"/>
-        </w:rPr>
       </w:pPr>
       <w:r>
+        <w:rPr>
+          <w:rFonts w:ascii="Times New Roman" w:hAnsi="Times New Roman" w:eastAsia="Times New Roman" w:cs="Times New Roman" w:csTheme="minorBidi"/>
+          <w:sz w:val="24"/>
+          <w:szCs w:val="22"/>
+        </w:rPr>
         <w:t xml:space="preserve">GUTTENTAG, Daniel. Airbnb: disruptive innovation and the rise of the sharing economy. </w:t>
       </w:r>
-      <w:proofErr w:type="spellStart"/>
       <w:r>
         <w:rPr>
-          <w:lang w:val="pt-BR"/>
+          <w:rFonts w:ascii="Times New Roman" w:hAnsi="Times New Roman" w:eastAsia="Times New Roman" w:cs="Times New Roman" w:csTheme="minorBidi"/>
+          <w:sz w:val="24"/>
+          <w:szCs w:val="22"/>
         </w:rPr>
         <w:t>Current</w:t>
       </w:r>
-      <w:proofErr w:type="spellEnd"/>
       <w:r>
         <w:rPr>
-          <w:lang w:val="pt-BR"/>
+          <w:rFonts w:ascii="Times New Roman" w:hAnsi="Times New Roman" w:eastAsia="Times New Roman" w:cs="Times New Roman" w:csTheme="minorBidi"/>
+          <w:sz w:val="24"/>
+          <w:szCs w:val="22"/>
         </w:rPr>
         <w:t xml:space="preserve"> </w:t>
       </w:r>
-      <w:proofErr w:type="spellStart"/>
       <w:r>
         <w:rPr>
-          <w:lang w:val="pt-BR"/>
+          <w:rFonts w:ascii="Times New Roman" w:hAnsi="Times New Roman" w:eastAsia="Times New Roman" w:cs="Times New Roman" w:csTheme="minorBidi"/>
+          <w:sz w:val="24"/>
+          <w:szCs w:val="22"/>
         </w:rPr>
         <w:t>Issues</w:t>
       </w:r>
-      <w:proofErr w:type="spellEnd"/>
       <w:r>
         <w:rPr>
-          <w:lang w:val="pt-BR"/>
+          <w:rFonts w:ascii="Times New Roman" w:hAnsi="Times New Roman" w:eastAsia="Times New Roman" w:cs="Times New Roman" w:csTheme="minorBidi"/>
+          <w:sz w:val="24"/>
+          <w:szCs w:val="22"/>
         </w:rPr>
         <w:t xml:space="preserve"> in </w:t>
       </w:r>
-      <w:proofErr w:type="spellStart"/>
       <w:r>
         <w:rPr>
-          <w:lang w:val="pt-BR"/>
+          <w:rFonts w:ascii="Times New Roman" w:hAnsi="Times New Roman" w:eastAsia="Times New Roman" w:cs="Times New Roman" w:csTheme="minorBidi"/>
+          <w:sz w:val="24"/>
+          <w:szCs w:val="22"/>
         </w:rPr>
         <w:t>Tourism</w:t>
       </w:r>
-      <w:proofErr w:type="spellEnd"/>
       <w:r>
         <w:rPr>
-          <w:lang w:val="pt-BR"/>
+          <w:rFonts w:ascii="Times New Roman" w:hAnsi="Times New Roman" w:eastAsia="Times New Roman" w:cs="Times New Roman" w:csTheme="minorBidi"/>
+          <w:sz w:val="24"/>
+          <w:szCs w:val="22"/>
         </w:rPr>
         <w:t>, v. 18, n. 12, p. 1192-1217, 2015.</w:t>
       </w:r>
@@ -1143,13 +1072,12 @@
       <w:pPr>
         <w:ind w:firstLine="420"/>
         <w:jc w:val="both"/>
-        <w:rPr>
-          <w:lang w:val="pt-BR"/>
-        </w:rPr>
       </w:pPr>
       <w:r>
         <w:rPr>
-          <w:lang w:val="pt-BR"/>
+          <w:rFonts w:ascii="Times New Roman" w:hAnsi="Times New Roman" w:eastAsia="Times New Roman" w:cs="Times New Roman" w:csTheme="minorBidi"/>
+          <w:sz w:val="24"/>
+          <w:szCs w:val="22"/>
         </w:rPr>
         <w:t>INSTITUTO BRASILEIRO DE GEOGRAFIA E ESTATÍSTICA (IBGE). Censo Agropecuário 2017: Resultados Definitivos. Rio de Janeiro: IBGE, 2019. Disponível em: https://www.ibge.gov.br/estatisticas/economicas/agricultura-e-pecuaria/9827-censo-agropecuario.html. Acesso em: 13 set. 2026.</w:t>
       </w:r>
@@ -1161,11 +1089,18 @@
       </w:pPr>
       <w:r>
         <w:rPr>
-          <w:lang w:val="pt-BR"/>
+          <w:rFonts w:ascii="Times New Roman" w:hAnsi="Times New Roman" w:eastAsia="Times New Roman" w:cs="Times New Roman" w:csTheme="minorBidi"/>
+          <w:sz w:val="24"/>
+          <w:szCs w:val="22"/>
         </w:rPr>
         <w:t xml:space="preserve">INSTITUTO BRASILEIRO DE GEOGRAFIA E ESTATÍSTICA (IBGE). Censo Demográfico 2022: Trabalho e Rendimento: Notas metodológicas e conceitos. </w:t>
       </w:r>
       <w:r>
+        <w:rPr>
+          <w:rFonts w:ascii="Times New Roman" w:hAnsi="Times New Roman" w:eastAsia="Times New Roman" w:cs="Times New Roman" w:csTheme="minorBidi"/>
+          <w:sz w:val="24"/>
+          <w:szCs w:val="22"/>
+        </w:rPr>
         <w:t>Rio de Janeiro: IBGE, 2022.</w:t>
       </w:r>
     </w:p>
@@ -1175,6 +1110,11 @@
         <w:jc w:val="both"/>
       </w:pPr>
       <w:r>
+        <w:rPr>
+          <w:rFonts w:ascii="Times New Roman" w:hAnsi="Times New Roman" w:eastAsia="Times New Roman" w:cs="Times New Roman" w:csTheme="minorBidi"/>
+          <w:sz w:val="24"/>
+          <w:szCs w:val="22"/>
+        </w:rPr>
         <w:t xml:space="preserve">MALCZEWSKI, Jacek. GIS and Multicriteria Decision Analysis. New York: John Wiley &amp; Sons, 1999. </w:t>
       </w:r>
     </w:p>
@@ -1182,13 +1122,12 @@
       <w:pPr>
         <w:ind w:firstLine="420"/>
         <w:jc w:val="both"/>
-        <w:rPr>
-          <w:lang w:val="pt-BR"/>
-        </w:rPr>
       </w:pPr>
       <w:r>
         <w:rPr>
-          <w:lang w:val="pt-BR"/>
+          <w:rFonts w:ascii="Times New Roman" w:hAnsi="Times New Roman" w:eastAsia="Times New Roman" w:cs="Times New Roman" w:csTheme="minorBidi"/>
+          <w:sz w:val="24"/>
+          <w:szCs w:val="22"/>
         </w:rPr>
         <w:t>MENDES, J. Análise Multicritério no Planejamento Territorial e Urbano. São Paulo: Editora Acadêmica, 2026</w:t>
       </w:r>
@@ -1197,13 +1136,12 @@
       <w:pPr>
         <w:ind w:firstLine="420"/>
         <w:jc w:val="both"/>
-        <w:rPr>
-          <w:lang w:val="pt-BR"/>
-        </w:rPr>
       </w:pPr>
       <w:r>
         <w:rPr>
-          <w:lang w:val="pt-BR"/>
+          <w:rFonts w:ascii="Times New Roman" w:hAnsi="Times New Roman" w:eastAsia="Times New Roman" w:cs="Times New Roman" w:csTheme="minorBidi"/>
+          <w:sz w:val="24"/>
+          <w:szCs w:val="22"/>
         </w:rPr>
         <w:t>MENDES FILHO, Luiz; et al. Inteligência de dados e destinos turísticos inteligentes: transformações na gestão pública e privada do turismo brasileiro. Revista de Turismo Contemporâneo, v. 9, n. 3, p. 412-435, 2021.</w:t>
       </w:r>
@@ -1212,41 +1150,44 @@
       <w:pPr>
         <w:ind w:firstLine="420"/>
         <w:jc w:val="both"/>
-        <w:rPr>
-          <w:lang w:val="pt-BR"/>
-        </w:rPr>
       </w:pPr>
       <w:r>
         <w:rPr>
-          <w:lang w:val="pt-BR"/>
+          <w:rFonts w:ascii="Times New Roman" w:hAnsi="Times New Roman" w:eastAsia="Times New Roman" w:cs="Times New Roman" w:csTheme="minorBidi"/>
+          <w:sz w:val="24"/>
+          <w:szCs w:val="22"/>
         </w:rPr>
         <w:t xml:space="preserve">MISKALO-CRUZ, Marcelle; GÂNDARA, José Manoel. Indicadores para Monitoramento e Gestão de Destinos Turísticos Inteligentes. </w:t>
       </w:r>
-      <w:proofErr w:type="spellStart"/>
       <w:r>
         <w:rPr>
-          <w:lang w:val="pt-BR"/>
+          <w:rFonts w:ascii="Times New Roman" w:hAnsi="Times New Roman" w:eastAsia="Times New Roman" w:cs="Times New Roman" w:csTheme="minorBidi"/>
+          <w:sz w:val="24"/>
+          <w:szCs w:val="22"/>
         </w:rPr>
         <w:t>Estudios</w:t>
       </w:r>
-      <w:proofErr w:type="spellEnd"/>
       <w:r>
         <w:rPr>
-          <w:lang w:val="pt-BR"/>
+          <w:rFonts w:ascii="Times New Roman" w:hAnsi="Times New Roman" w:eastAsia="Times New Roman" w:cs="Times New Roman" w:csTheme="minorBidi"/>
+          <w:sz w:val="24"/>
+          <w:szCs w:val="22"/>
         </w:rPr>
         <w:t xml:space="preserve"> y Perspectivas </w:t>
       </w:r>
-      <w:proofErr w:type="spellStart"/>
       <w:r>
         <w:rPr>
-          <w:lang w:val="pt-BR"/>
+          <w:rFonts w:ascii="Times New Roman" w:hAnsi="Times New Roman" w:eastAsia="Times New Roman" w:cs="Times New Roman" w:csTheme="minorBidi"/>
+          <w:sz w:val="24"/>
+          <w:szCs w:val="22"/>
         </w:rPr>
         <w:t>en</w:t>
       </w:r>
-      <w:proofErr w:type="spellEnd"/>
       <w:r>
         <w:rPr>
-          <w:lang w:val="pt-BR"/>
+          <w:rFonts w:ascii="Times New Roman" w:hAnsi="Times New Roman" w:eastAsia="Times New Roman" w:cs="Times New Roman" w:csTheme="minorBidi"/>
+          <w:sz w:val="24"/>
+          <w:szCs w:val="22"/>
         </w:rPr>
         <w:t xml:space="preserve"> Turismo, v. 26, n. 1, p. 1-21, 2017.</w:t>
       </w:r>
@@ -1255,35 +1196,37 @@
       <w:pPr>
         <w:ind w:firstLine="420"/>
         <w:jc w:val="both"/>
-        <w:rPr>
-          <w:lang w:val="pt-BR"/>
-        </w:rPr>
       </w:pPr>
       <w:r>
         <w:rPr>
-          <w:lang w:val="pt-BR"/>
+          <w:rFonts w:ascii="Times New Roman" w:hAnsi="Times New Roman" w:eastAsia="Times New Roman" w:cs="Times New Roman" w:csTheme="minorBidi"/>
+          <w:sz w:val="24"/>
+          <w:szCs w:val="22"/>
         </w:rPr>
         <w:t xml:space="preserve">NIEDERLE, Paulo André; SCHNEIDER, Sergio. </w:t>
       </w:r>
-      <w:proofErr w:type="gramStart"/>
       <w:r>
         <w:rPr>
-          <w:lang w:val="pt-BR"/>
+          <w:rFonts w:ascii="Times New Roman" w:hAnsi="Times New Roman" w:eastAsia="Times New Roman" w:cs="Times New Roman" w:csTheme="minorBidi"/>
+          <w:sz w:val="24"/>
+          <w:szCs w:val="22"/>
         </w:rPr>
         <w:t>Aonde</w:t>
       </w:r>
-      <w:proofErr w:type="gramEnd"/>
       <w:r>
         <w:rPr>
-          <w:lang w:val="pt-BR"/>
+          <w:rFonts w:ascii="Times New Roman" w:hAnsi="Times New Roman" w:eastAsia="Times New Roman" w:cs="Times New Roman" w:csTheme="minorBidi"/>
+          <w:sz w:val="24"/>
+          <w:szCs w:val="22"/>
         </w:rPr>
         <w:t xml:space="preserve"> estão os mercados? Mudanças institucionais e orientação política na agricultura familiar. In: SCHNEIDER, </w:t>
       </w:r>
       <w:r>
         <w:rPr>
-          <w:lang w:val="pt-BR"/>
+          <w:rFonts w:ascii="Times New Roman" w:hAnsi="Times New Roman" w:eastAsia="Times New Roman" w:cs="Times New Roman" w:csTheme="minorBidi"/>
+          <w:sz w:val="24"/>
+          <w:szCs w:val="22"/>
         </w:rPr>
-        <w:lastRenderedPageBreak/>
         <w:t>Sergio; CONTERATO, Marcelo Antonio (Org.). Dinâmica regional e desenvolvimento rural. Porto Alegre: Editora da UFRGS, 2011. p. 101-125.</w:t>
       </w:r>
     </w:p>
@@ -1291,13 +1234,12 @@
       <w:pPr>
         <w:ind w:firstLine="420"/>
         <w:jc w:val="both"/>
-        <w:rPr>
-          <w:lang w:val="pt-BR"/>
-        </w:rPr>
       </w:pPr>
       <w:r>
         <w:rPr>
-          <w:lang w:val="pt-BR"/>
+          <w:rFonts w:ascii="Times New Roman" w:hAnsi="Times New Roman" w:eastAsia="Times New Roman" w:cs="Times New Roman" w:csTheme="minorBidi"/>
+          <w:sz w:val="24"/>
+          <w:szCs w:val="22"/>
         </w:rPr>
         <w:t>PINTO, Aníbal. Heterogeneidade estrutural e modelo de desenvolvimento recente. In: JOSÉ, Serra (Org.). América Latina: ensaios de interpretação econômica. Rio de Janeiro: Paz e Terra, 1970. p. 10-31.</w:t>
       </w:r>
@@ -1306,27 +1248,28 @@
       <w:pPr>
         <w:ind w:firstLine="420"/>
         <w:jc w:val="both"/>
-        <w:rPr>
-          <w:lang w:val="pt-BR"/>
-        </w:rPr>
       </w:pPr>
       <w:r>
         <w:rPr>
-          <w:lang w:val="pt-BR"/>
+          <w:rFonts w:ascii="Times New Roman" w:hAnsi="Times New Roman" w:eastAsia="Times New Roman" w:cs="Times New Roman" w:csTheme="minorBidi"/>
+          <w:sz w:val="24"/>
+          <w:szCs w:val="22"/>
         </w:rPr>
         <w:t xml:space="preserve">PORCILE, Gabriel. A evolução das ideias da CEPAL: de </w:t>
       </w:r>
-      <w:proofErr w:type="spellStart"/>
       <w:r>
         <w:rPr>
-          <w:lang w:val="pt-BR"/>
+          <w:rFonts w:ascii="Times New Roman" w:hAnsi="Times New Roman" w:eastAsia="Times New Roman" w:cs="Times New Roman" w:csTheme="minorBidi"/>
+          <w:sz w:val="24"/>
+          <w:szCs w:val="22"/>
         </w:rPr>
         <w:t>Raúl</w:t>
       </w:r>
-      <w:proofErr w:type="spellEnd"/>
       <w:r>
         <w:rPr>
-          <w:lang w:val="pt-BR"/>
+          <w:rFonts w:ascii="Times New Roman" w:hAnsi="Times New Roman" w:eastAsia="Times New Roman" w:cs="Times New Roman" w:csTheme="minorBidi"/>
+          <w:sz w:val="24"/>
+          <w:szCs w:val="22"/>
         </w:rPr>
         <w:t xml:space="preserve"> Prebisch à heterogeneidade estrutural. Santiago: Nações Unidas, 2011.</w:t>
       </w:r>
@@ -1338,19 +1281,34 @@
       </w:pPr>
       <w:r>
         <w:rPr>
-          <w:lang w:val="pt-BR"/>
+          <w:rFonts w:ascii="Times New Roman" w:hAnsi="Times New Roman" w:eastAsia="Times New Roman" w:cs="Times New Roman" w:csTheme="minorBidi"/>
+          <w:sz w:val="24"/>
+          <w:szCs w:val="22"/>
         </w:rPr>
         <w:t xml:space="preserve">SERVIÇO NACIONAL DE APRENDIZAGEM RURAL. Turismo rural: legislação e gestão de empreendimentos. </w:t>
       </w:r>
       <w:r>
+        <w:rPr>
+          <w:rFonts w:ascii="Times New Roman" w:hAnsi="Times New Roman" w:eastAsia="Times New Roman" w:cs="Times New Roman" w:csTheme="minorBidi"/>
+          <w:sz w:val="24"/>
+          <w:szCs w:val="22"/>
+        </w:rPr>
         <w:t xml:space="preserve">Brasília: </w:t>
       </w:r>
-      <w:proofErr w:type="spellStart"/>
       <w:r>
+        <w:rPr>
+          <w:rFonts w:ascii="Times New Roman" w:hAnsi="Times New Roman" w:eastAsia="Times New Roman" w:cs="Times New Roman" w:csTheme="minorBidi"/>
+          <w:sz w:val="24"/>
+          <w:szCs w:val="22"/>
+        </w:rPr>
         <w:t>Senar</w:t>
       </w:r>
-      <w:proofErr w:type="spellEnd"/>
       <w:r>
+        <w:rPr>
+          <w:rFonts w:ascii="Times New Roman" w:hAnsi="Times New Roman" w:eastAsia="Times New Roman" w:cs="Times New Roman" w:csTheme="minorBidi"/>
+          <w:sz w:val="24"/>
+          <w:szCs w:val="22"/>
+        </w:rPr>
         <w:t>, 2020. 108 p. il. (Coleção Senar, 286). ISBN 978-85-7664-239-8.</w:t>
       </w:r>
     </w:p>
@@ -1360,6 +1318,11 @@
         <w:jc w:val="both"/>
       </w:pPr>
       <w:r>
+        <w:rPr>
+          <w:rFonts w:ascii="Times New Roman" w:hAnsi="Times New Roman" w:eastAsia="Times New Roman" w:cs="Times New Roman" w:csTheme="minorBidi"/>
+          <w:sz w:val="24"/>
+          <w:szCs w:val="22"/>
+        </w:rPr>
         <w:t>UN TOURISM. Tourism and Rural Development: A Policy Perspective. Madrid: World Tourism Organization, 2023.</w:t>
       </w:r>
     </w:p>
@@ -1378,7 +1341,6 @@
     <w:sectPr>
       <w:pgSz w:w="12240" w:h="15840"/>
       <w:pgMar w:top="1417" w:right="1701" w:bottom="1417" w:left="1701" w:header="720" w:footer="720" w:gutter="0"/>
-      <w:cols w:space="720"/>
       <w:docGrid w:linePitch="360"/>
     </w:sectPr>
   </w:body>

</xml_diff>